<commit_message>
render quarto with new metadata
</commit_message>
<xml_diff>
--- a/_site/ciberseguridad-ethical-hacking-ceh/2024-09-03-ejecutando-payload/index.docx
+++ b/_site/ciberseguridad-ethical-hacking-ceh/2024-09-03-ejecutando-payload/index.docx
@@ -50,7 +50,7 @@
         <w:pStyle w:val="Heading1"/>
       </w:pPr>
       <w:r>
-        <w:t xml:space="preserve">Guía de Git Cómo trabajar en equipo en proyectos: Aprende a usar Git para controlar versiones, colaborar con otros desarrolladores y mantener tu código organizado.</w:t>
+        <w:t xml:space="preserve">Ejecutando payloads en ethical hacking</w:t>
       </w:r>
     </w:p>
     <w:p>
@@ -199,7 +199,15 @@
     </w:p>
     <w:p>
       <w:pPr>
-        <w:pStyle w:val="FirstParagraph"/>
+        <w:pStyle w:val="AbstractFirstParagraph"/>
+      </w:pPr>
+      <w:r>
+        <w:t xml:space="preserve">Este abstract será actualizado una vez que se complete el contenido final del artículo.</w:t>
+      </w:r>
+    </w:p>
+    <w:p>
+      <w:pPr>
+        <w:pStyle w:val="BodyText"/>
       </w:pPr>
       <w:r>
         <w:rPr>
@@ -224,7 +232,7 @@
         <w:pStyle w:val="Heading1"/>
       </w:pPr>
       <w:r>
-        <w:t xml:space="preserve">Guía de Git Cómo trabajar en equipo en proyectos: Aprende a usar Git para controlar versiones, colaborar con otros desarrolladores y mantener tu código organizado.</w:t>
+        <w:t xml:space="preserve">Ejecutando payloads en ethical hacking</w:t>
       </w:r>
     </w:p>
     <w:bookmarkEnd w:id="26"/>

</xml_diff>